<commit_message>
Update Documentação - Voiture.docx
</commit_message>
<xml_diff>
--- a/Documentação - Voiture.docx
+++ b/Documentação - Voiture.docx
@@ -214,6 +214,7 @@
       <w:r>
         <w:rPr>
           <w:rFonts w:cs="Times New Roman"/>
+          <w:noProof/>
           <w:szCs w:val="24"/>
         </w:rPr>
         <mc:AlternateContent>
@@ -5386,14 +5387,30 @@
           <w:b/>
           <w:bCs/>
         </w:rPr>
-        <w:t>fornecedor_id</w:t>
-      </w:r>
-      <w:proofErr w:type="spellEnd"/>
-      <w:r>
-        <w:rPr>
-          <w:rFonts w:cs="Times New Roman"/>
-        </w:rPr>
-        <w:t xml:space="preserve">(INT, </w:t>
+        <w:t>fornecedor_</w:t>
+      </w:r>
+      <w:proofErr w:type="gramStart"/>
+      <w:r>
+        <w:rPr>
+          <w:rFonts w:cs="Times New Roman"/>
+          <w:b/>
+          <w:bCs/>
+        </w:rPr>
+        <w:t>id</w:t>
+      </w:r>
+      <w:proofErr w:type="spellEnd"/>
+      <w:r>
+        <w:rPr>
+          <w:rFonts w:cs="Times New Roman"/>
+        </w:rPr>
+        <w:t>(</w:t>
+      </w:r>
+      <w:proofErr w:type="gramEnd"/>
+      <w:r>
+        <w:rPr>
+          <w:rFonts w:cs="Times New Roman"/>
+        </w:rPr>
+        <w:t xml:space="preserve">INT, </w:t>
       </w:r>
       <w:proofErr w:type="spellStart"/>
       <w:r>
@@ -5435,7 +5452,61 @@
         <w:rPr>
           <w:rFonts w:cs="Times New Roman"/>
         </w:rPr>
-        <w:t>), é o identificador do fornecedor que está fornecendo as peças.</w:t>
+        <w:t>), é o identificador do fornecedor que está fornecendo as peças</w:t>
+      </w:r>
+      <w:r>
+        <w:rPr>
+          <w:rFonts w:cs="Times New Roman"/>
+        </w:rPr>
+        <w:t>;</w:t>
+      </w:r>
+    </w:p>
+    <w:p>
+      <w:pPr>
+        <w:pStyle w:val="PargrafodaLista"/>
+        <w:spacing w:line="360" w:lineRule="auto"/>
+        <w:ind w:left="2160"/>
+        <w:rPr>
+          <w:rFonts w:cs="Times New Roman"/>
+        </w:rPr>
+      </w:pPr>
+      <w:proofErr w:type="spellStart"/>
+      <w:r>
+        <w:rPr>
+          <w:rFonts w:cs="Times New Roman"/>
+          <w:b/>
+          <w:bCs/>
+        </w:rPr>
+        <w:t>data_pedido_</w:t>
+      </w:r>
+      <w:proofErr w:type="gramStart"/>
+      <w:r>
+        <w:rPr>
+          <w:rFonts w:cs="Times New Roman"/>
+          <w:b/>
+          <w:bCs/>
+        </w:rPr>
+        <w:t>entrada</w:t>
+      </w:r>
+      <w:proofErr w:type="spellEnd"/>
+      <w:r>
+        <w:rPr>
+          <w:rFonts w:cs="Times New Roman"/>
+        </w:rPr>
+        <w:t>(</w:t>
+      </w:r>
+      <w:proofErr w:type="gramEnd"/>
+      <w:r>
+        <w:rPr>
+          <w:rFonts w:cs="Times New Roman"/>
+        </w:rPr>
+        <w:t>TIMESTAMP)</w:t>
+      </w:r>
+      <w:r>
+        <w:rPr>
+          <w:rFonts w:cs="Times New Roman"/>
+        </w:rPr>
+        <w:t>, é a data e a hora do pedido de entrada.</w:t>
       </w:r>
     </w:p>
     <w:p>
@@ -5703,14 +5774,30 @@
           <w:b/>
           <w:bCs/>
         </w:rPr>
-        <w:t>pedido_entrada_id</w:t>
-      </w:r>
-      <w:proofErr w:type="spellEnd"/>
-      <w:r>
-        <w:rPr>
-          <w:rFonts w:cs="Times New Roman"/>
-        </w:rPr>
-        <w:t xml:space="preserve">(INT, Primary Key, </w:t>
+        <w:t>pedido_entrada_</w:t>
+      </w:r>
+      <w:proofErr w:type="gramStart"/>
+      <w:r>
+        <w:rPr>
+          <w:rFonts w:cs="Times New Roman"/>
+          <w:b/>
+          <w:bCs/>
+        </w:rPr>
+        <w:t>id</w:t>
+      </w:r>
+      <w:proofErr w:type="spellEnd"/>
+      <w:r>
+        <w:rPr>
+          <w:rFonts w:cs="Times New Roman"/>
+        </w:rPr>
+        <w:t>(</w:t>
+      </w:r>
+      <w:proofErr w:type="gramEnd"/>
+      <w:r>
+        <w:rPr>
+          <w:rFonts w:cs="Times New Roman"/>
+        </w:rPr>
+        <w:t xml:space="preserve">INT, Primary Key, </w:t>
       </w:r>
       <w:proofErr w:type="spellStart"/>
       <w:r>
@@ -5738,8 +5825,116 @@
         <w:rPr>
           <w:rFonts w:cs="Times New Roman"/>
         </w:rPr>
-        <w:t>), é o identificador do pedido em questão.</w:t>
-      </w:r>
+        <w:t>), é o identificador do pedido em questão</w:t>
+      </w:r>
+      <w:r>
+        <w:rPr>
+          <w:rFonts w:cs="Times New Roman"/>
+        </w:rPr>
+        <w:t>;</w:t>
+      </w:r>
+    </w:p>
+    <w:p>
+      <w:pPr>
+        <w:pStyle w:val="PargrafodaLista"/>
+        <w:spacing w:line="360" w:lineRule="auto"/>
+        <w:ind w:left="2160"/>
+        <w:rPr>
+          <w:rFonts w:cs="Times New Roman"/>
+        </w:rPr>
+      </w:pPr>
+      <w:proofErr w:type="spellStart"/>
+      <w:r>
+        <w:rPr>
+          <w:rFonts w:cs="Times New Roman"/>
+          <w:b/>
+          <w:bCs/>
+        </w:rPr>
+        <w:t>detalhe_</w:t>
+      </w:r>
+      <w:r>
+        <w:rPr>
+          <w:rFonts w:cs="Times New Roman"/>
+          <w:b/>
+          <w:bCs/>
+        </w:rPr>
+        <w:t>entrada</w:t>
+      </w:r>
+      <w:r>
+        <w:rPr>
+          <w:rFonts w:cs="Times New Roman"/>
+          <w:b/>
+          <w:bCs/>
+        </w:rPr>
+        <w:t>_</w:t>
+      </w:r>
+      <w:proofErr w:type="gramStart"/>
+      <w:r>
+        <w:rPr>
+          <w:rFonts w:cs="Times New Roman"/>
+          <w:b/>
+          <w:bCs/>
+        </w:rPr>
+        <w:t>item</w:t>
+      </w:r>
+      <w:proofErr w:type="spellEnd"/>
+      <w:r>
+        <w:rPr>
+          <w:rFonts w:cs="Times New Roman"/>
+        </w:rPr>
+        <w:t>(</w:t>
+      </w:r>
+      <w:proofErr w:type="gramEnd"/>
+      <w:r>
+        <w:rPr>
+          <w:rFonts w:cs="Times New Roman"/>
+        </w:rPr>
+        <w:t xml:space="preserve">INT, </w:t>
+      </w:r>
+      <w:proofErr w:type="spellStart"/>
+      <w:r>
+        <w:rPr>
+          <w:rFonts w:cs="Times New Roman"/>
+        </w:rPr>
+        <w:t>Not</w:t>
+      </w:r>
+      <w:proofErr w:type="spellEnd"/>
+      <w:r>
+        <w:rPr>
+          <w:rFonts w:cs="Times New Roman"/>
+        </w:rPr>
+        <w:t xml:space="preserve"> </w:t>
+      </w:r>
+      <w:proofErr w:type="spellStart"/>
+      <w:r>
+        <w:rPr>
+          <w:rFonts w:cs="Times New Roman"/>
+        </w:rPr>
+        <w:t>Null</w:t>
+      </w:r>
+      <w:proofErr w:type="spellEnd"/>
+      <w:r>
+        <w:rPr>
+          <w:rFonts w:cs="Times New Roman"/>
+        </w:rPr>
+        <w:t>), é o</w:t>
+      </w:r>
+      <w:r>
+        <w:rPr>
+          <w:rFonts w:cs="Times New Roman"/>
+        </w:rPr>
+        <w:t xml:space="preserve"> identificador de um produto em um pedido.</w:t>
+      </w:r>
+    </w:p>
+    <w:p>
+      <w:pPr>
+        <w:pStyle w:val="PargrafodaLista"/>
+        <w:spacing w:line="360" w:lineRule="auto"/>
+        <w:ind w:left="2160"/>
+        <w:rPr>
+          <w:rFonts w:cs="Times New Roman"/>
+        </w:rPr>
+      </w:pPr>
     </w:p>
     <w:p>
       <w:pPr>
@@ -5803,6 +5998,7 @@
           <w:b/>
           <w:bCs/>
         </w:rPr>
+        <w:lastRenderedPageBreak/>
         <w:t xml:space="preserve">id </w:t>
       </w:r>
       <w:r>
@@ -6008,7 +6204,6 @@
           <w:b/>
           <w:bCs/>
         </w:rPr>
-        <w:lastRenderedPageBreak/>
         <w:t>detalhe_entrada_pedido_entrada_id</w:t>
       </w:r>
       <w:proofErr w:type="spellEnd"/>
@@ -6313,8 +6508,84 @@
         <w:rPr>
           <w:rFonts w:cs="Times New Roman"/>
         </w:rPr>
-        <w:t>), é o status da movimentação.</w:t>
-      </w:r>
+        <w:t>), é o status da movimentação</w:t>
+      </w:r>
+      <w:r>
+        <w:rPr>
+          <w:rFonts w:cs="Times New Roman"/>
+        </w:rPr>
+        <w:t>;</w:t>
+      </w:r>
+    </w:p>
+    <w:p>
+      <w:pPr>
+        <w:pStyle w:val="PargrafodaLista"/>
+        <w:spacing w:line="360" w:lineRule="auto"/>
+        <w:ind w:left="2160"/>
+        <w:rPr>
+          <w:rFonts w:cs="Times New Roman"/>
+        </w:rPr>
+      </w:pPr>
+      <w:proofErr w:type="spellStart"/>
+      <w:r>
+        <w:rPr>
+          <w:rFonts w:cs="Times New Roman"/>
+          <w:b/>
+          <w:bCs/>
+        </w:rPr>
+        <w:t>data_pedido_</w:t>
+      </w:r>
+      <w:proofErr w:type="gramStart"/>
+      <w:r>
+        <w:rPr>
+          <w:rFonts w:cs="Times New Roman"/>
+          <w:b/>
+          <w:bCs/>
+        </w:rPr>
+        <w:t>saida</w:t>
+      </w:r>
+      <w:proofErr w:type="spellEnd"/>
+      <w:r>
+        <w:rPr>
+          <w:rFonts w:cs="Times New Roman"/>
+        </w:rPr>
+        <w:t>(</w:t>
+      </w:r>
+      <w:proofErr w:type="gramEnd"/>
+      <w:r>
+        <w:rPr>
+          <w:rFonts w:cs="Times New Roman"/>
+        </w:rPr>
+        <w:t>TIMESTAMP)</w:t>
+      </w:r>
+      <w:r>
+        <w:rPr>
+          <w:rFonts w:cs="Times New Roman"/>
+        </w:rPr>
+        <w:t xml:space="preserve">, é a data e a hora do pedido de </w:t>
+      </w:r>
+      <w:r>
+        <w:rPr>
+          <w:rFonts w:cs="Times New Roman"/>
+        </w:rPr>
+        <w:t>saída</w:t>
+      </w:r>
+      <w:r>
+        <w:rPr>
+          <w:rFonts w:cs="Times New Roman"/>
+        </w:rPr>
+        <w:t>.</w:t>
+      </w:r>
+    </w:p>
+    <w:p>
+      <w:pPr>
+        <w:pStyle w:val="PargrafodaLista"/>
+        <w:spacing w:line="360" w:lineRule="auto"/>
+        <w:ind w:left="2160"/>
+        <w:rPr>
+          <w:rFonts w:cs="Times New Roman"/>
+        </w:rPr>
+      </w:pPr>
     </w:p>
     <w:p>
       <w:pPr>
@@ -6565,14 +6836,30 @@
           <w:b/>
           <w:bCs/>
         </w:rPr>
-        <w:t>estoque_id</w:t>
-      </w:r>
-      <w:proofErr w:type="spellEnd"/>
-      <w:r>
-        <w:rPr>
-          <w:rFonts w:cs="Times New Roman"/>
-        </w:rPr>
-        <w:t xml:space="preserve">(INT, </w:t>
+        <w:t>estoque_</w:t>
+      </w:r>
+      <w:proofErr w:type="gramStart"/>
+      <w:r>
+        <w:rPr>
+          <w:rFonts w:cs="Times New Roman"/>
+          <w:b/>
+          <w:bCs/>
+        </w:rPr>
+        <w:t>id</w:t>
+      </w:r>
+      <w:proofErr w:type="spellEnd"/>
+      <w:r>
+        <w:rPr>
+          <w:rFonts w:cs="Times New Roman"/>
+        </w:rPr>
+        <w:t>(</w:t>
+      </w:r>
+      <w:proofErr w:type="gramEnd"/>
+      <w:r>
+        <w:rPr>
+          <w:rFonts w:cs="Times New Roman"/>
+        </w:rPr>
+        <w:t xml:space="preserve">INT, </w:t>
       </w:r>
       <w:proofErr w:type="spellStart"/>
       <w:r>
@@ -6615,6 +6902,82 @@
           <w:rFonts w:cs="Times New Roman"/>
         </w:rPr>
         <w:t>), é o identificador do estoque daqueles produtos;</w:t>
+      </w:r>
+    </w:p>
+    <w:p>
+      <w:pPr>
+        <w:pStyle w:val="PargrafodaLista"/>
+        <w:spacing w:line="360" w:lineRule="auto"/>
+        <w:ind w:left="2160"/>
+        <w:rPr>
+          <w:rFonts w:cs="Times New Roman"/>
+        </w:rPr>
+      </w:pPr>
+      <w:proofErr w:type="spellStart"/>
+      <w:r>
+        <w:rPr>
+          <w:rFonts w:cs="Times New Roman"/>
+          <w:b/>
+          <w:bCs/>
+        </w:rPr>
+        <w:t>detalhe_saida_</w:t>
+      </w:r>
+      <w:proofErr w:type="gramStart"/>
+      <w:r>
+        <w:rPr>
+          <w:rFonts w:cs="Times New Roman"/>
+          <w:b/>
+          <w:bCs/>
+        </w:rPr>
+        <w:t>item</w:t>
+      </w:r>
+      <w:proofErr w:type="spellEnd"/>
+      <w:r>
+        <w:rPr>
+          <w:rFonts w:cs="Times New Roman"/>
+        </w:rPr>
+        <w:t>(</w:t>
+      </w:r>
+      <w:proofErr w:type="gramEnd"/>
+      <w:r>
+        <w:rPr>
+          <w:rFonts w:cs="Times New Roman"/>
+        </w:rPr>
+        <w:t xml:space="preserve">INT, </w:t>
+      </w:r>
+      <w:proofErr w:type="spellStart"/>
+      <w:r>
+        <w:rPr>
+          <w:rFonts w:cs="Times New Roman"/>
+        </w:rPr>
+        <w:t>Not</w:t>
+      </w:r>
+      <w:proofErr w:type="spellEnd"/>
+      <w:r>
+        <w:rPr>
+          <w:rFonts w:cs="Times New Roman"/>
+        </w:rPr>
+        <w:t xml:space="preserve"> </w:t>
+      </w:r>
+      <w:proofErr w:type="spellStart"/>
+      <w:r>
+        <w:rPr>
+          <w:rFonts w:cs="Times New Roman"/>
+        </w:rPr>
+        <w:t>Null</w:t>
+      </w:r>
+      <w:proofErr w:type="spellEnd"/>
+      <w:r>
+        <w:rPr>
+          <w:rFonts w:cs="Times New Roman"/>
+        </w:rPr>
+        <w:t>), é o</w:t>
+      </w:r>
+      <w:r>
+        <w:rPr>
+          <w:rFonts w:cs="Times New Roman"/>
+        </w:rPr>
+        <w:t xml:space="preserve"> identificador de um produto em um pedido.</w:t>
       </w:r>
     </w:p>
     <w:p>
@@ -6646,6 +7009,7 @@
           <w:b/>
           <w:bCs/>
         </w:rPr>
+        <w:lastRenderedPageBreak/>
         <w:t>movimentacao_saida</w:t>
       </w:r>
       <w:proofErr w:type="spellEnd"/>
@@ -6953,7 +7317,6 @@
         <w:rPr>
           <w:rFonts w:cs="Times New Roman"/>
         </w:rPr>
-        <w:lastRenderedPageBreak/>
         <w:t>iot</w:t>
       </w:r>
       <w:proofErr w:type="spellEnd"/>
@@ -6998,6 +7361,9 @@
         </w:rPr>
       </w:pPr>
       <w:r>
+        <w:rPr>
+          <w:noProof/>
+        </w:rPr>
         <w:drawing>
           <wp:inline distT="0" distB="0" distL="0" distR="0" wp14:anchorId="697372D1" wp14:editId="39833351">
             <wp:extent cx="4823524" cy="4549140"/>
@@ -10192,6 +10558,7 @@
         <w:rPr>
           <w:b/>
           <w:bCs/>
+          <w:noProof/>
         </w:rPr>
         <w:drawing>
           <wp:inline distT="0" distB="0" distL="0" distR="0" wp14:anchorId="2A4A230F" wp14:editId="527F3B30">
@@ -10273,6 +10640,7 @@
         <w:rPr>
           <w:b/>
           <w:bCs/>
+          <w:noProof/>
         </w:rPr>
         <w:drawing>
           <wp:inline distT="0" distB="0" distL="0" distR="0" wp14:anchorId="1D20112F" wp14:editId="0166FEB2">
@@ -10393,6 +10761,7 @@
         <w:rPr>
           <w:b/>
           <w:bCs/>
+          <w:noProof/>
         </w:rPr>
         <w:drawing>
           <wp:inline distT="0" distB="0" distL="0" distR="0" wp14:anchorId="0ABFB2CD" wp14:editId="35F19623">
@@ -10479,6 +10848,7 @@
         <w:rPr>
           <w:b/>
           <w:bCs/>
+          <w:noProof/>
         </w:rPr>
         <w:drawing>
           <wp:inline distT="0" distB="0" distL="0" distR="0" wp14:anchorId="7E209F32" wp14:editId="74831DD9">
@@ -10658,6 +11028,7 @@
         <w:rPr>
           <w:b/>
           <w:bCs/>
+          <w:noProof/>
         </w:rPr>
         <w:drawing>
           <wp:inline distT="0" distB="0" distL="0" distR="0" wp14:anchorId="50A45234" wp14:editId="3EFF5166">
@@ -10761,6 +11132,7 @@
         <w:rPr>
           <w:b/>
           <w:bCs/>
+          <w:noProof/>
         </w:rPr>
         <w:drawing>
           <wp:inline distT="0" distB="0" distL="0" distR="0" wp14:anchorId="4BBBEC4E" wp14:editId="1276D982">
@@ -10911,6 +11283,7 @@
         <w:rPr>
           <w:b/>
           <w:bCs/>
+          <w:noProof/>
         </w:rPr>
         <w:drawing>
           <wp:inline distT="0" distB="0" distL="0" distR="0" wp14:anchorId="63398F7F" wp14:editId="316A0569">
@@ -11007,6 +11380,7 @@
         <w:rPr>
           <w:b/>
           <w:bCs/>
+          <w:noProof/>
         </w:rPr>
         <w:drawing>
           <wp:inline distT="0" distB="0" distL="0" distR="0" wp14:anchorId="6DB10707" wp14:editId="5249B8EF">
@@ -11123,6 +11497,9 @@
         <w:ind w:left="708"/>
       </w:pPr>
       <w:r>
+        <w:rPr>
+          <w:noProof/>
+        </w:rPr>
         <w:drawing>
           <wp:inline distT="0" distB="0" distL="0" distR="0" wp14:anchorId="02E667C9" wp14:editId="65733B7A">
             <wp:extent cx="5382054" cy="3027145"/>
@@ -11202,6 +11579,9 @@
         <w:ind w:left="708"/>
       </w:pPr>
       <w:r>
+        <w:rPr>
+          <w:noProof/>
+        </w:rPr>
         <w:drawing>
           <wp:inline distT="0" distB="0" distL="0" distR="0" wp14:anchorId="55AAE98D" wp14:editId="059A7B3F">
             <wp:extent cx="5313145" cy="2403236"/>
@@ -11343,6 +11723,7 @@
         <w:rPr>
           <w:b/>
           <w:bCs/>
+          <w:noProof/>
         </w:rPr>
         <w:drawing>
           <wp:inline distT="0" distB="0" distL="0" distR="0" wp14:anchorId="7EC81D22" wp14:editId="3033D216">
@@ -11437,6 +11818,7 @@
         <w:rPr>
           <w:b/>
           <w:bCs/>
+          <w:noProof/>
         </w:rPr>
         <w:drawing>
           <wp:inline distT="0" distB="0" distL="0" distR="0" wp14:anchorId="475C79B9" wp14:editId="55917D4A">
@@ -11509,22 +11891,223 @@
     </w:p>
     <w:p>
       <w:pPr>
-        <w:widowControl/>
-        <w:autoSpaceDE/>
-        <w:autoSpaceDN/>
-        <w:spacing w:after="160" w:line="278" w:lineRule="auto"/>
-        <w:jc w:val="left"/>
-        <w:rPr>
-          <w:b/>
-          <w:bCs/>
-        </w:rPr>
-      </w:pPr>
-      <w:r>
-        <w:rPr>
-          <w:b/>
-          <w:bCs/>
-        </w:rPr>
-        <w:br w:type="page"/>
+        <w:spacing w:line="360" w:lineRule="auto"/>
+        <w:ind w:left="708"/>
+      </w:pPr>
+      <w:r>
+        <w:t xml:space="preserve">Esta tela permite o gerenciamento </w:t>
+      </w:r>
+      <w:r>
+        <w:t>de todos os pedidos de entrada</w:t>
+      </w:r>
+      <w:r>
+        <w:t xml:space="preserve"> cadastrados no sistema. Nela, o usuário pode visualizar uma lista contendo as principais informações dos </w:t>
+      </w:r>
+      <w:r>
+        <w:t>pedidos</w:t>
+      </w:r>
+      <w:r>
+        <w:t xml:space="preserve">, como </w:t>
+      </w:r>
+      <w:r>
+        <w:t>id</w:t>
+      </w:r>
+      <w:r>
+        <w:t xml:space="preserve">, </w:t>
+      </w:r>
+      <w:r>
+        <w:t>nome do produto</w:t>
+      </w:r>
+      <w:r>
+        <w:t xml:space="preserve">, </w:t>
+      </w:r>
+      <w:r>
+        <w:t>quantidade</w:t>
+      </w:r>
+      <w:r>
+        <w:t xml:space="preserve">, </w:t>
+      </w:r>
+      <w:r>
+        <w:t>status</w:t>
+      </w:r>
+      <w:r>
+        <w:t xml:space="preserve">, </w:t>
+      </w:r>
+      <w:r>
+        <w:t>data do pedido</w:t>
+      </w:r>
+      <w:r>
+        <w:t xml:space="preserve"> e </w:t>
+      </w:r>
+      <w:r>
+        <w:t>data do processamento</w:t>
+      </w:r>
+      <w:r>
+        <w:t xml:space="preserve">. Além disso, é possível cadastrar um novo </w:t>
+      </w:r>
+      <w:r>
+        <w:t>pedido de entrada</w:t>
+      </w:r>
+      <w:r>
+        <w:t xml:space="preserve"> por meio do botão "Novo</w:t>
+      </w:r>
+      <w:r>
+        <w:t xml:space="preserve"> Pedido de Entrada</w:t>
+      </w:r>
+      <w:r>
+        <w:t xml:space="preserve">", bem como </w:t>
+      </w:r>
+      <w:r>
+        <w:t>processar</w:t>
+      </w:r>
+      <w:r>
+        <w:t xml:space="preserve"> ou </w:t>
+      </w:r>
+      <w:r>
+        <w:t>cancelar pedidos</w:t>
+      </w:r>
+      <w:r>
+        <w:t xml:space="preserve"> já cadastrados através das ações disponíveis na tabela.</w:t>
+      </w:r>
+    </w:p>
+    <w:p>
+      <w:pPr>
+        <w:spacing w:line="360" w:lineRule="auto"/>
+        <w:ind w:left="708"/>
+      </w:pPr>
+    </w:p>
+    <w:p>
+      <w:pPr>
+        <w:spacing w:line="360" w:lineRule="auto"/>
+        <w:ind w:left="708"/>
+        <w:rPr>
+          <w:b/>
+          <w:bCs/>
+        </w:rPr>
+      </w:pPr>
+      <w:proofErr w:type="spellStart"/>
+      <w:r>
+        <w:rPr>
+          <w:b/>
+          <w:bCs/>
+        </w:rPr>
+        <w:t>Wireframe</w:t>
+      </w:r>
+      <w:proofErr w:type="spellEnd"/>
+    </w:p>
+    <w:p>
+      <w:pPr>
+        <w:spacing w:line="360" w:lineRule="auto"/>
+        <w:ind w:left="708"/>
+      </w:pPr>
+      <w:r>
+        <w:rPr>
+          <w:noProof/>
+        </w:rPr>
+        <w:drawing>
+          <wp:inline distT="0" distB="0" distL="0" distR="0" wp14:anchorId="32551889" wp14:editId="4650E55D">
+            <wp:extent cx="5326380" cy="2941810"/>
+            <wp:effectExtent l="0" t="0" r="7620" b="0"/>
+            <wp:docPr id="293111605" name="Imagem 1"/>
+            <wp:cNvGraphicFramePr>
+              <a:graphicFrameLocks xmlns:a="http://schemas.openxmlformats.org/drawingml/2006/main" noChangeAspect="1"/>
+            </wp:cNvGraphicFramePr>
+            <a:graphic xmlns:a="http://schemas.openxmlformats.org/drawingml/2006/main">
+              <a:graphicData uri="http://schemas.openxmlformats.org/drawingml/2006/picture">
+                <pic:pic xmlns:pic="http://schemas.openxmlformats.org/drawingml/2006/picture">
+                  <pic:nvPicPr>
+                    <pic:cNvPr id="293111605" name=""/>
+                    <pic:cNvPicPr/>
+                  </pic:nvPicPr>
+                  <pic:blipFill>
+                    <a:blip r:embed="rId21"/>
+                    <a:stretch>
+                      <a:fillRect/>
+                    </a:stretch>
+                  </pic:blipFill>
+                  <pic:spPr>
+                    <a:xfrm>
+                      <a:off x="0" y="0"/>
+                      <a:ext cx="5338395" cy="2948446"/>
+                    </a:xfrm>
+                    <a:prstGeom prst="rect">
+                      <a:avLst/>
+                    </a:prstGeom>
+                  </pic:spPr>
+                </pic:pic>
+              </a:graphicData>
+            </a:graphic>
+          </wp:inline>
+        </w:drawing>
+      </w:r>
+    </w:p>
+    <w:p>
+      <w:pPr>
+        <w:spacing w:line="360" w:lineRule="auto"/>
+        <w:ind w:left="708"/>
+      </w:pPr>
+    </w:p>
+    <w:p>
+      <w:pPr>
+        <w:spacing w:line="360" w:lineRule="auto"/>
+        <w:ind w:left="708"/>
+        <w:rPr>
+          <w:b/>
+          <w:bCs/>
+        </w:rPr>
+      </w:pPr>
+      <w:r>
+        <w:rPr>
+          <w:b/>
+          <w:bCs/>
+        </w:rPr>
+        <w:t>Interface</w:t>
+      </w:r>
+    </w:p>
+    <w:p>
+      <w:pPr>
+        <w:spacing w:line="360" w:lineRule="auto"/>
+        <w:ind w:left="708"/>
+      </w:pPr>
+      <w:r>
+        <w:rPr>
+          <w:noProof/>
+        </w:rPr>
+        <w:drawing>
+          <wp:inline distT="0" distB="0" distL="0" distR="0" wp14:anchorId="548EF157" wp14:editId="42C21F8A">
+            <wp:extent cx="5372100" cy="2884742"/>
+            <wp:effectExtent l="0" t="0" r="0" b="0"/>
+            <wp:docPr id="841140464" name="Imagem 1"/>
+            <wp:cNvGraphicFramePr>
+              <a:graphicFrameLocks xmlns:a="http://schemas.openxmlformats.org/drawingml/2006/main" noChangeAspect="1"/>
+            </wp:cNvGraphicFramePr>
+            <a:graphic xmlns:a="http://schemas.openxmlformats.org/drawingml/2006/main">
+              <a:graphicData uri="http://schemas.openxmlformats.org/drawingml/2006/picture">
+                <pic:pic xmlns:pic="http://schemas.openxmlformats.org/drawingml/2006/picture">
+                  <pic:nvPicPr>
+                    <pic:cNvPr id="841140464" name=""/>
+                    <pic:cNvPicPr/>
+                  </pic:nvPicPr>
+                  <pic:blipFill>
+                    <a:blip r:embed="rId22"/>
+                    <a:stretch>
+                      <a:fillRect/>
+                    </a:stretch>
+                  </pic:blipFill>
+                  <pic:spPr>
+                    <a:xfrm>
+                      <a:off x="0" y="0"/>
+                      <a:ext cx="5381767" cy="2889933"/>
+                    </a:xfrm>
+                    <a:prstGeom prst="rect">
+                      <a:avLst/>
+                    </a:prstGeom>
+                  </pic:spPr>
+                </pic:pic>
+              </a:graphicData>
+            </a:graphic>
+          </wp:inline>
+        </w:drawing>
       </w:r>
     </w:p>
     <w:p>
@@ -11551,6 +12134,174 @@
     </w:p>
     <w:p>
       <w:pPr>
+        <w:spacing w:line="360" w:lineRule="auto"/>
+        <w:ind w:left="708"/>
+      </w:pPr>
+      <w:r>
+        <w:t xml:space="preserve">Esta tela permite </w:t>
+      </w:r>
+      <w:r>
+        <w:t>que o cadastro de um pedido de entrada seja iniciado</w:t>
+      </w:r>
+      <w:r>
+        <w:t xml:space="preserve"> no sistema. Nela, o usuário</w:t>
+      </w:r>
+      <w:r>
+        <w:t xml:space="preserve"> seleciona um fornecedor, o produto e a quantidade que deseja acrescentar em seu estoque.</w:t>
+      </w:r>
+      <w:r>
+        <w:t xml:space="preserve"> </w:t>
+      </w:r>
+      <w:r>
+        <w:t>Após clicar em “Adicionar item”</w:t>
+      </w:r>
+      <w:r>
+        <w:t xml:space="preserve">, </w:t>
+      </w:r>
+      <w:r>
+        <w:t>as informações serão redirecionadas para uma tabela ao lado e basta clicar em “Salvar pedido” para conseguir abrir todas as informações do pedido e uma tela que possa adicionar mais produtos caso deseje.</w:t>
+      </w:r>
+    </w:p>
+    <w:p>
+      <w:pPr>
+        <w:spacing w:line="360" w:lineRule="auto"/>
+        <w:ind w:left="708"/>
+      </w:pPr>
+    </w:p>
+    <w:p>
+      <w:pPr>
+        <w:spacing w:line="360" w:lineRule="auto"/>
+        <w:ind w:left="708"/>
+        <w:rPr>
+          <w:b/>
+          <w:bCs/>
+        </w:rPr>
+      </w:pPr>
+      <w:proofErr w:type="spellStart"/>
+      <w:r>
+        <w:rPr>
+          <w:b/>
+          <w:bCs/>
+        </w:rPr>
+        <w:t>Wireframe</w:t>
+      </w:r>
+      <w:proofErr w:type="spellEnd"/>
+    </w:p>
+    <w:p>
+      <w:pPr>
+        <w:spacing w:line="360" w:lineRule="auto"/>
+        <w:ind w:left="708"/>
+      </w:pPr>
+      <w:r>
+        <w:rPr>
+          <w:b/>
+          <w:bCs/>
+          <w:noProof/>
+        </w:rPr>
+        <w:drawing>
+          <wp:inline distT="0" distB="0" distL="0" distR="0" wp14:anchorId="384BC1C6" wp14:editId="2321BC3E">
+            <wp:extent cx="5201347" cy="2926080"/>
+            <wp:effectExtent l="0" t="0" r="0" b="7620"/>
+            <wp:docPr id="739337335" name="Imagem 1"/>
+            <wp:cNvGraphicFramePr>
+              <a:graphicFrameLocks xmlns:a="http://schemas.openxmlformats.org/drawingml/2006/main" noChangeAspect="1"/>
+            </wp:cNvGraphicFramePr>
+            <a:graphic xmlns:a="http://schemas.openxmlformats.org/drawingml/2006/main">
+              <a:graphicData uri="http://schemas.openxmlformats.org/drawingml/2006/picture">
+                <pic:pic xmlns:pic="http://schemas.openxmlformats.org/drawingml/2006/picture">
+                  <pic:nvPicPr>
+                    <pic:cNvPr id="739337335" name=""/>
+                    <pic:cNvPicPr/>
+                  </pic:nvPicPr>
+                  <pic:blipFill>
+                    <a:blip r:embed="rId23"/>
+                    <a:stretch>
+                      <a:fillRect/>
+                    </a:stretch>
+                  </pic:blipFill>
+                  <pic:spPr>
+                    <a:xfrm>
+                      <a:off x="0" y="0"/>
+                      <a:ext cx="5214890" cy="2933699"/>
+                    </a:xfrm>
+                    <a:prstGeom prst="rect">
+                      <a:avLst/>
+                    </a:prstGeom>
+                  </pic:spPr>
+                </pic:pic>
+              </a:graphicData>
+            </a:graphic>
+          </wp:inline>
+        </w:drawing>
+      </w:r>
+    </w:p>
+    <w:p>
+      <w:pPr>
+        <w:spacing w:line="360" w:lineRule="auto"/>
+        <w:ind w:left="708"/>
+        <w:rPr>
+          <w:b/>
+          <w:bCs/>
+        </w:rPr>
+      </w:pPr>
+      <w:r>
+        <w:rPr>
+          <w:b/>
+          <w:bCs/>
+        </w:rPr>
+        <w:t>Interface</w:t>
+      </w:r>
+    </w:p>
+    <w:p>
+      <w:pPr>
+        <w:spacing w:line="360" w:lineRule="auto"/>
+        <w:ind w:left="708"/>
+      </w:pPr>
+      <w:r>
+        <w:rPr>
+          <w:b/>
+          <w:bCs/>
+          <w:noProof/>
+        </w:rPr>
+        <w:drawing>
+          <wp:inline distT="0" distB="0" distL="0" distR="0" wp14:anchorId="5F9B49D5" wp14:editId="50DE8461">
+            <wp:extent cx="5212080" cy="2788471"/>
+            <wp:effectExtent l="0" t="0" r="7620" b="0"/>
+            <wp:docPr id="1727459085" name="Imagem 1"/>
+            <wp:cNvGraphicFramePr>
+              <a:graphicFrameLocks xmlns:a="http://schemas.openxmlformats.org/drawingml/2006/main" noChangeAspect="1"/>
+            </wp:cNvGraphicFramePr>
+            <a:graphic xmlns:a="http://schemas.openxmlformats.org/drawingml/2006/main">
+              <a:graphicData uri="http://schemas.openxmlformats.org/drawingml/2006/picture">
+                <pic:pic xmlns:pic="http://schemas.openxmlformats.org/drawingml/2006/picture">
+                  <pic:nvPicPr>
+                    <pic:cNvPr id="1727459085" name=""/>
+                    <pic:cNvPicPr/>
+                  </pic:nvPicPr>
+                  <pic:blipFill>
+                    <a:blip r:embed="rId24"/>
+                    <a:stretch>
+                      <a:fillRect/>
+                    </a:stretch>
+                  </pic:blipFill>
+                  <pic:spPr>
+                    <a:xfrm>
+                      <a:off x="0" y="0"/>
+                      <a:ext cx="5241147" cy="2804022"/>
+                    </a:xfrm>
+                    <a:prstGeom prst="rect">
+                      <a:avLst/>
+                    </a:prstGeom>
+                  </pic:spPr>
+                </pic:pic>
+              </a:graphicData>
+            </a:graphic>
+          </wp:inline>
+        </w:drawing>
+      </w:r>
+    </w:p>
+    <w:p>
+      <w:pPr>
         <w:widowControl/>
         <w:autoSpaceDE/>
         <w:autoSpaceDN/>
@@ -11631,6 +12382,9 @@
         <w:ind w:left="708"/>
       </w:pPr>
       <w:r>
+        <w:rPr>
+          <w:noProof/>
+        </w:rPr>
         <w:drawing>
           <wp:inline distT="0" distB="0" distL="0" distR="0" wp14:anchorId="10EDA7B5" wp14:editId="4DA61D28">
             <wp:extent cx="5295900" cy="2976937"/>
@@ -11649,7 +12403,7 @@
                     </pic:cNvPicPr>
                   </pic:nvPicPr>
                   <pic:blipFill>
-                    <a:blip r:embed="rId21">
+                    <a:blip r:embed="rId25">
                       <a:extLst>
                         <a:ext uri="{28A0092B-C50C-407E-A947-70E740481C1C}">
                           <a14:useLocalDpi xmlns:a14="http://schemas.microsoft.com/office/drawing/2010/main" val="0"/>
@@ -11732,6 +12486,7 @@
         <w:rPr>
           <w:b/>
           <w:bCs/>
+          <w:noProof/>
         </w:rPr>
         <w:drawing>
           <wp:inline distT="0" distB="0" distL="0" distR="0" wp14:anchorId="3B931415" wp14:editId="5235DC9F">
@@ -11749,7 +12504,7 @@
                     <pic:cNvPicPr/>
                   </pic:nvPicPr>
                   <pic:blipFill>
-                    <a:blip r:embed="rId22"/>
+                    <a:blip r:embed="rId26"/>
                     <a:stretch>
                       <a:fillRect/>
                     </a:stretch>
@@ -11851,6 +12606,9 @@
         </w:rPr>
       </w:pPr>
       <w:r>
+        <w:rPr>
+          <w:noProof/>
+        </w:rPr>
         <w:drawing>
           <wp:inline distT="0" distB="0" distL="0" distR="0" wp14:anchorId="66EBAA42" wp14:editId="456229DC">
             <wp:extent cx="5384800" cy="3028950"/>
@@ -11869,7 +12627,7 @@
                     </pic:cNvPicPr>
                   </pic:nvPicPr>
                   <pic:blipFill>
-                    <a:blip r:embed="rId23">
+                    <a:blip r:embed="rId27">
                       <a:extLst>
                         <a:ext uri="{28A0092B-C50C-407E-A947-70E740481C1C}">
                           <a14:useLocalDpi xmlns:a14="http://schemas.microsoft.com/office/drawing/2010/main" val="0"/>
@@ -11928,6 +12686,9 @@
         </w:rPr>
       </w:pPr>
       <w:r>
+        <w:rPr>
+          <w:noProof/>
+        </w:rPr>
         <w:drawing>
           <wp:inline distT="0" distB="0" distL="0" distR="0" wp14:anchorId="38CE5B7A" wp14:editId="6DE56FA6">
             <wp:extent cx="5257800" cy="2494136"/>
@@ -11946,7 +12707,7 @@
                     </pic:cNvPicPr>
                   </pic:nvPicPr>
                   <pic:blipFill>
-                    <a:blip r:embed="rId24">
+                    <a:blip r:embed="rId28">
                       <a:extLst>
                         <a:ext uri="{28A0092B-C50C-407E-A947-70E740481C1C}">
                           <a14:useLocalDpi xmlns:a14="http://schemas.microsoft.com/office/drawing/2010/main" val="0"/>
@@ -12058,6 +12819,7 @@
         <w:rPr>
           <w:b/>
           <w:bCs/>
+          <w:noProof/>
         </w:rPr>
         <w:drawing>
           <wp:inline distT="0" distB="0" distL="0" distR="0" wp14:anchorId="09AE47A7" wp14:editId="768BEC77">
@@ -12077,7 +12839,7 @@
                     </pic:cNvPicPr>
                   </pic:nvPicPr>
                   <pic:blipFill>
-                    <a:blip r:embed="rId25" cstate="print">
+                    <a:blip r:embed="rId29" cstate="print">
                       <a:extLst>
                         <a:ext uri="{28A0092B-C50C-407E-A947-70E740481C1C}">
                           <a14:useLocalDpi xmlns:a14="http://schemas.microsoft.com/office/drawing/2010/main" val="0"/>
@@ -12153,6 +12915,7 @@
         <w:rPr>
           <w:b/>
           <w:bCs/>
+          <w:noProof/>
         </w:rPr>
         <w:drawing>
           <wp:inline distT="0" distB="0" distL="0" distR="0" wp14:anchorId="46AA8C9A" wp14:editId="3AB324E0">
@@ -12172,7 +12935,7 @@
                     </pic:cNvPicPr>
                   </pic:nvPicPr>
                   <pic:blipFill>
-                    <a:blip r:embed="rId26" cstate="print">
+                    <a:blip r:embed="rId30" cstate="print">
                       <a:extLst>
                         <a:ext uri="{28A0092B-C50C-407E-A947-70E740481C1C}">
                           <a14:useLocalDpi xmlns:a14="http://schemas.microsoft.com/office/drawing/2010/main" val="0"/>
@@ -12290,6 +13053,7 @@
         <w:rPr>
           <w:b/>
           <w:bCs/>
+          <w:noProof/>
         </w:rPr>
         <w:drawing>
           <wp:inline distT="0" distB="0" distL="0" distR="0" wp14:anchorId="44EFBB36" wp14:editId="737EAC58">
@@ -12309,7 +13073,7 @@
                     </pic:cNvPicPr>
                   </pic:nvPicPr>
                   <pic:blipFill>
-                    <a:blip r:embed="rId27" cstate="print">
+                    <a:blip r:embed="rId31" cstate="print">
                       <a:extLst>
                         <a:ext uri="{28A0092B-C50C-407E-A947-70E740481C1C}">
                           <a14:useLocalDpi xmlns:a14="http://schemas.microsoft.com/office/drawing/2010/main" val="0"/>
@@ -12385,6 +13149,7 @@
         <w:rPr>
           <w:b/>
           <w:bCs/>
+          <w:noProof/>
         </w:rPr>
         <w:drawing>
           <wp:inline distT="0" distB="0" distL="0" distR="0" wp14:anchorId="6BF4A9B7" wp14:editId="680248E3">
@@ -12404,7 +13169,7 @@
                     </pic:cNvPicPr>
                   </pic:nvPicPr>
                   <pic:blipFill rotWithShape="1">
-                    <a:blip r:embed="rId28" cstate="print">
+                    <a:blip r:embed="rId32" cstate="print">
                       <a:extLst>
                         <a:ext uri="{28A0092B-C50C-407E-A947-70E740481C1C}">
                           <a14:useLocalDpi xmlns:a14="http://schemas.microsoft.com/office/drawing/2010/main" val="0"/>
@@ -12527,6 +13292,9 @@
         </w:rPr>
       </w:pPr>
       <w:r>
+        <w:rPr>
+          <w:noProof/>
+        </w:rPr>
         <w:drawing>
           <wp:inline distT="0" distB="0" distL="0" distR="0" wp14:anchorId="0D4CD78B" wp14:editId="02CFD645">
             <wp:extent cx="5343525" cy="2994283"/>
@@ -12545,7 +13313,7 @@
                     </pic:cNvPicPr>
                   </pic:nvPicPr>
                   <pic:blipFill>
-                    <a:blip r:embed="rId29">
+                    <a:blip r:embed="rId33">
                       <a:extLst>
                         <a:ext uri="{28A0092B-C50C-407E-A947-70E740481C1C}">
                           <a14:useLocalDpi xmlns:a14="http://schemas.microsoft.com/office/drawing/2010/main" val="0"/>
@@ -12634,6 +13402,7 @@
         <w:rPr>
           <w:b/>
           <w:bCs/>
+          <w:noProof/>
         </w:rPr>
         <w:drawing>
           <wp:inline distT="0" distB="0" distL="0" distR="0" wp14:anchorId="2E519CC7" wp14:editId="2B5D5D0D">
@@ -12651,7 +13420,7 @@
                     <pic:cNvPicPr/>
                   </pic:nvPicPr>
                   <pic:blipFill>
-                    <a:blip r:embed="rId30"/>
+                    <a:blip r:embed="rId34"/>
                     <a:stretch>
                       <a:fillRect/>
                     </a:stretch>
@@ -12748,6 +13517,7 @@
         <w:rPr>
           <w:b/>
           <w:bCs/>
+          <w:noProof/>
         </w:rPr>
         <w:drawing>
           <wp:inline distT="0" distB="0" distL="0" distR="0" wp14:anchorId="5A1D93EB" wp14:editId="7661E7BD">
@@ -12767,7 +13537,7 @@
                     </pic:cNvPicPr>
                   </pic:nvPicPr>
                   <pic:blipFill>
-                    <a:blip r:embed="rId31" cstate="print">
+                    <a:blip r:embed="rId35" cstate="print">
                       <a:extLst>
                         <a:ext uri="{28A0092B-C50C-407E-A947-70E740481C1C}">
                           <a14:useLocalDpi xmlns:a14="http://schemas.microsoft.com/office/drawing/2010/main" val="0"/>
@@ -12843,6 +13613,7 @@
         <w:rPr>
           <w:b/>
           <w:bCs/>
+          <w:noProof/>
         </w:rPr>
         <w:drawing>
           <wp:inline distT="0" distB="0" distL="0" distR="0" wp14:anchorId="1E855AEB" wp14:editId="0900351D">
@@ -12862,7 +13633,7 @@
                     </pic:cNvPicPr>
                   </pic:nvPicPr>
                   <pic:blipFill rotWithShape="1">
-                    <a:blip r:embed="rId32" cstate="print">
+                    <a:blip r:embed="rId36" cstate="print">
                       <a:extLst>
                         <a:ext uri="{28A0092B-C50C-407E-A947-70E740481C1C}">
                           <a14:useLocalDpi xmlns:a14="http://schemas.microsoft.com/office/drawing/2010/main" val="0"/>
@@ -12975,6 +13746,7 @@
         <w:rPr>
           <w:b/>
           <w:bCs/>
+          <w:noProof/>
         </w:rPr>
         <w:drawing>
           <wp:inline distT="0" distB="0" distL="0" distR="0" wp14:anchorId="67280E63" wp14:editId="5383C54F">
@@ -12994,7 +13766,7 @@
                     </pic:cNvPicPr>
                   </pic:nvPicPr>
                   <pic:blipFill>
-                    <a:blip r:embed="rId33" cstate="print">
+                    <a:blip r:embed="rId37" cstate="print">
                       <a:extLst>
                         <a:ext uri="{28A0092B-C50C-407E-A947-70E740481C1C}">
                           <a14:useLocalDpi xmlns:a14="http://schemas.microsoft.com/office/drawing/2010/main" val="0"/>
@@ -13070,6 +13842,7 @@
         <w:rPr>
           <w:b/>
           <w:bCs/>
+          <w:noProof/>
         </w:rPr>
         <w:drawing>
           <wp:inline distT="0" distB="0" distL="0" distR="0" wp14:anchorId="13AAC2C4" wp14:editId="512EBC72">
@@ -13089,7 +13862,7 @@
                     </pic:cNvPicPr>
                   </pic:nvPicPr>
                   <pic:blipFill rotWithShape="1">
-                    <a:blip r:embed="rId34" cstate="print">
+                    <a:blip r:embed="rId38" cstate="print">
                       <a:extLst>
                         <a:ext uri="{28A0092B-C50C-407E-A947-70E740481C1C}">
                           <a14:useLocalDpi xmlns:a14="http://schemas.microsoft.com/office/drawing/2010/main" val="0"/>
@@ -13215,6 +13988,7 @@
         <w:rPr>
           <w:b/>
           <w:bCs/>
+          <w:noProof/>
         </w:rPr>
         <w:drawing>
           <wp:inline distT="0" distB="0" distL="0" distR="0" wp14:anchorId="7DF58879" wp14:editId="694079A1">
@@ -13234,7 +14008,7 @@
                     </pic:cNvPicPr>
                   </pic:nvPicPr>
                   <pic:blipFill>
-                    <a:blip r:embed="rId35" cstate="print">
+                    <a:blip r:embed="rId39" cstate="print">
                       <a:extLst>
                         <a:ext uri="{28A0092B-C50C-407E-A947-70E740481C1C}">
                           <a14:useLocalDpi xmlns:a14="http://schemas.microsoft.com/office/drawing/2010/main" val="0"/>
@@ -13310,6 +14084,7 @@
         <w:rPr>
           <w:b/>
           <w:bCs/>
+          <w:noProof/>
         </w:rPr>
         <w:drawing>
           <wp:inline distT="0" distB="0" distL="0" distR="0" wp14:anchorId="10F4AE62" wp14:editId="2FB5168C">
@@ -13329,7 +14104,7 @@
                     </pic:cNvPicPr>
                   </pic:nvPicPr>
                   <pic:blipFill>
-                    <a:blip r:embed="rId36" cstate="print">
+                    <a:blip r:embed="rId40" cstate="print">
                       <a:extLst>
                         <a:ext uri="{28A0092B-C50C-407E-A947-70E740481C1C}">
                           <a14:useLocalDpi xmlns:a14="http://schemas.microsoft.com/office/drawing/2010/main" val="0"/>
@@ -13450,6 +14225,7 @@
         <w:rPr>
           <w:b/>
           <w:bCs/>
+          <w:noProof/>
         </w:rPr>
         <w:drawing>
           <wp:inline distT="0" distB="0" distL="0" distR="0" wp14:anchorId="3AC3B497" wp14:editId="6A658236">
@@ -13469,7 +14245,7 @@
                     </pic:cNvPicPr>
                   </pic:nvPicPr>
                   <pic:blipFill>
-                    <a:blip r:embed="rId37" cstate="print">
+                    <a:blip r:embed="rId41" cstate="print">
                       <a:extLst>
                         <a:ext uri="{28A0092B-C50C-407E-A947-70E740481C1C}">
                           <a14:useLocalDpi xmlns:a14="http://schemas.microsoft.com/office/drawing/2010/main" val="0"/>
@@ -13553,6 +14329,7 @@
         <w:rPr>
           <w:b/>
           <w:bCs/>
+          <w:noProof/>
         </w:rPr>
         <w:drawing>
           <wp:inline distT="0" distB="0" distL="0" distR="0" wp14:anchorId="1E6DB123" wp14:editId="38B26AB9">
@@ -13572,7 +14349,7 @@
                     </pic:cNvPicPr>
                   </pic:nvPicPr>
                   <pic:blipFill rotWithShape="1">
-                    <a:blip r:embed="rId38" cstate="print">
+                    <a:blip r:embed="rId42" cstate="print">
                       <a:extLst>
                         <a:ext uri="{28A0092B-C50C-407E-A947-70E740481C1C}">
                           <a14:useLocalDpi xmlns:a14="http://schemas.microsoft.com/office/drawing/2010/main" val="0"/>
@@ -13685,6 +14462,7 @@
         <w:rPr>
           <w:b/>
           <w:bCs/>
+          <w:noProof/>
         </w:rPr>
         <w:drawing>
           <wp:inline distT="0" distB="0" distL="0" distR="0" wp14:anchorId="29FE367F" wp14:editId="0F1016DF">
@@ -13704,7 +14482,7 @@
                     </pic:cNvPicPr>
                   </pic:nvPicPr>
                   <pic:blipFill>
-                    <a:blip r:embed="rId35" cstate="print">
+                    <a:blip r:embed="rId39" cstate="print">
                       <a:extLst>
                         <a:ext uri="{28A0092B-C50C-407E-A947-70E740481C1C}">
                           <a14:useLocalDpi xmlns:a14="http://schemas.microsoft.com/office/drawing/2010/main" val="0"/>
@@ -13780,6 +14558,7 @@
         <w:rPr>
           <w:b/>
           <w:bCs/>
+          <w:noProof/>
         </w:rPr>
         <w:drawing>
           <wp:inline distT="0" distB="0" distL="0" distR="0" wp14:anchorId="293A9DB1" wp14:editId="7F2139C6">
@@ -13799,7 +14578,7 @@
                     </pic:cNvPicPr>
                   </pic:nvPicPr>
                   <pic:blipFill>
-                    <a:blip r:embed="rId39" cstate="print">
+                    <a:blip r:embed="rId43" cstate="print">
                       <a:extLst>
                         <a:ext uri="{28A0092B-C50C-407E-A947-70E740481C1C}">
                           <a14:useLocalDpi xmlns:a14="http://schemas.microsoft.com/office/drawing/2010/main" val="0"/>
@@ -13911,6 +14690,7 @@
         <w:rPr>
           <w:b/>
           <w:bCs/>
+          <w:noProof/>
         </w:rPr>
         <w:drawing>
           <wp:inline distT="0" distB="0" distL="0" distR="0" wp14:anchorId="44EC0000" wp14:editId="5A136FFF">
@@ -13930,7 +14710,7 @@
                     </pic:cNvPicPr>
                   </pic:nvPicPr>
                   <pic:blipFill>
-                    <a:blip r:embed="rId40" cstate="print">
+                    <a:blip r:embed="rId44" cstate="print">
                       <a:extLst>
                         <a:ext uri="{28A0092B-C50C-407E-A947-70E740481C1C}">
                           <a14:useLocalDpi xmlns:a14="http://schemas.microsoft.com/office/drawing/2010/main" val="0"/>
@@ -14006,6 +14786,7 @@
         <w:rPr>
           <w:b/>
           <w:bCs/>
+          <w:noProof/>
         </w:rPr>
         <w:drawing>
           <wp:inline distT="0" distB="0" distL="0" distR="0" wp14:anchorId="48DEE9E9" wp14:editId="6AEC1CFE">
@@ -14025,7 +14806,7 @@
                     </pic:cNvPicPr>
                   </pic:nvPicPr>
                   <pic:blipFill>
-                    <a:blip r:embed="rId41" cstate="print">
+                    <a:blip r:embed="rId45" cstate="print">
                       <a:extLst>
                         <a:ext uri="{28A0092B-C50C-407E-A947-70E740481C1C}">
                           <a14:useLocalDpi xmlns:a14="http://schemas.microsoft.com/office/drawing/2010/main" val="0"/>
@@ -14176,6 +14957,9 @@
         <w:ind w:left="708"/>
       </w:pPr>
       <w:r>
+        <w:rPr>
+          <w:noProof/>
+        </w:rPr>
         <w:drawing>
           <wp:inline distT="0" distB="0" distL="0" distR="0" wp14:anchorId="51D63495" wp14:editId="00939636">
             <wp:extent cx="2463056" cy="4378594"/>
@@ -14194,7 +14978,7 @@
                     </pic:cNvPicPr>
                   </pic:nvPicPr>
                   <pic:blipFill>
-                    <a:blip r:embed="rId42" cstate="print">
+                    <a:blip r:embed="rId46" cstate="print">
                       <a:extLst>
                         <a:ext uri="{28A0092B-C50C-407E-A947-70E740481C1C}">
                           <a14:useLocalDpi xmlns:a14="http://schemas.microsoft.com/office/drawing/2010/main" val="0"/>
@@ -14313,6 +15097,9 @@
         <w:ind w:firstLine="708"/>
       </w:pPr>
       <w:r>
+        <w:rPr>
+          <w:noProof/>
+        </w:rPr>
         <w:drawing>
           <wp:inline distT="0" distB="0" distL="0" distR="0" wp14:anchorId="05FF62CC" wp14:editId="2A4FB3C4">
             <wp:extent cx="2442213" cy="4341541"/>
@@ -14331,7 +15118,7 @@
                     </pic:cNvPicPr>
                   </pic:nvPicPr>
                   <pic:blipFill>
-                    <a:blip r:embed="rId43" cstate="print">
+                    <a:blip r:embed="rId47" cstate="print">
                       <a:extLst>
                         <a:ext uri="{28A0092B-C50C-407E-A947-70E740481C1C}">
                           <a14:useLocalDpi xmlns:a14="http://schemas.microsoft.com/office/drawing/2010/main" val="0"/>
@@ -14444,6 +15231,9 @@
         <w:ind w:firstLine="708"/>
       </w:pPr>
       <w:r>
+        <w:rPr>
+          <w:noProof/>
+        </w:rPr>
         <w:drawing>
           <wp:inline distT="0" distB="0" distL="0" distR="0" wp14:anchorId="3436E099" wp14:editId="7877DAC5">
             <wp:extent cx="2601951" cy="4625506"/>
@@ -14462,7 +15252,7 @@
                     </pic:cNvPicPr>
                   </pic:nvPicPr>
                   <pic:blipFill>
-                    <a:blip r:embed="rId44" cstate="print">
+                    <a:blip r:embed="rId48" cstate="print">
                       <a:extLst>
                         <a:ext uri="{28A0092B-C50C-407E-A947-70E740481C1C}">
                           <a14:useLocalDpi xmlns:a14="http://schemas.microsoft.com/office/drawing/2010/main" val="0"/>
@@ -14579,6 +15369,9 @@
         <w:tab/>
       </w:r>
       <w:r>
+        <w:rPr>
+          <w:noProof/>
+        </w:rPr>
         <w:drawing>
           <wp:inline distT="0" distB="0" distL="0" distR="0" wp14:anchorId="1A3BC566" wp14:editId="1DADC81C">
             <wp:extent cx="2364059" cy="4202606"/>
@@ -14597,7 +15390,7 @@
                     </pic:cNvPicPr>
                   </pic:nvPicPr>
                   <pic:blipFill>
-                    <a:blip r:embed="rId45" cstate="print">
+                    <a:blip r:embed="rId49" cstate="print">
                       <a:extLst>
                         <a:ext uri="{28A0092B-C50C-407E-A947-70E740481C1C}">
                           <a14:useLocalDpi xmlns:a14="http://schemas.microsoft.com/office/drawing/2010/main" val="0"/>
@@ -14710,6 +15503,9 @@
         <w:ind w:firstLine="708"/>
       </w:pPr>
       <w:r>
+        <w:rPr>
+          <w:noProof/>
+        </w:rPr>
         <w:drawing>
           <wp:inline distT="0" distB="0" distL="0" distR="0" wp14:anchorId="5573A647" wp14:editId="6C76794A">
             <wp:extent cx="2474259" cy="4398507"/>
@@ -14728,7 +15524,7 @@
                     </pic:cNvPicPr>
                   </pic:nvPicPr>
                   <pic:blipFill>
-                    <a:blip r:embed="rId46" cstate="print">
+                    <a:blip r:embed="rId50" cstate="print">
                       <a:extLst>
                         <a:ext uri="{28A0092B-C50C-407E-A947-70E740481C1C}">
                           <a14:useLocalDpi xmlns:a14="http://schemas.microsoft.com/office/drawing/2010/main" val="0"/>
@@ -14844,6 +15640,9 @@
         <w:tab/>
       </w:r>
       <w:r>
+        <w:rPr>
+          <w:noProof/>
+        </w:rPr>
         <w:drawing>
           <wp:inline distT="0" distB="0" distL="0" distR="0" wp14:anchorId="2788CF43" wp14:editId="4903C5BB">
             <wp:extent cx="2494019" cy="4433636"/>
@@ -14862,7 +15661,7 @@
                     </pic:cNvPicPr>
                   </pic:nvPicPr>
                   <pic:blipFill>
-                    <a:blip r:embed="rId47" cstate="print">
+                    <a:blip r:embed="rId51" cstate="print">
                       <a:extLst>
                         <a:ext uri="{28A0092B-C50C-407E-A947-70E740481C1C}">
                           <a14:useLocalDpi xmlns:a14="http://schemas.microsoft.com/office/drawing/2010/main" val="0"/>
@@ -14991,6 +15790,9 @@
         </w:rPr>
       </w:pPr>
       <w:r>
+        <w:rPr>
+          <w:noProof/>
+        </w:rPr>
         <w:drawing>
           <wp:inline distT="0" distB="0" distL="0" distR="0" wp14:anchorId="4CC4DE6E" wp14:editId="4D1ACEDE">
             <wp:extent cx="2544780" cy="4523874"/>
@@ -15009,7 +15811,7 @@
                     </pic:cNvPicPr>
                   </pic:nvPicPr>
                   <pic:blipFill>
-                    <a:blip r:embed="rId48" cstate="print">
+                    <a:blip r:embed="rId52" cstate="print">
                       <a:extLst>
                         <a:ext uri="{28A0092B-C50C-407E-A947-70E740481C1C}">
                           <a14:useLocalDpi xmlns:a14="http://schemas.microsoft.com/office/drawing/2010/main" val="0"/>
@@ -16599,6 +17401,7 @@
   <w:style w:type="character" w:default="1" w:styleId="Fontepargpadro">
     <w:name w:val="Default Paragraph Font"/>
     <w:uiPriority w:val="1"/>
+    <w:semiHidden/>
     <w:unhideWhenUsed/>
   </w:style>
   <w:style w:type="table" w:default="1" w:styleId="Tabelanormal">

</xml_diff>